<commit_message>
feat: force SSG pour TOUTES les pages (8 langues)
- app/[locale]/layout.tsx: ajoute dynamicParams=false et revalidate=false
  Force la génération statique pour toutes les pages enfants

- Pages [slug] mises à jour pour inclure locale dans generateStaticParams :
  - app/[locale]/blog/[slug]/page.tsx
  - app/[locale]/controverses/[slug]/page.tsx
  - app/[locale]/reseau/[slug]/page.tsx
  - app/[locale]/investigations/[slug]/page.tsx (déjà fait)

Toutes les pages sont maintenant générées au build pour les 8 locales,
pas en SSR (server-side rendering). Les traductions s'affichent correctement
sur chaque version linguistique.

Co-Authored-By: Claude Haiku 4.5 <noreply@anthropic.com>
</commit_message>
<xml_diff>
--- a/public/edouard_philippe_biographie.docx
+++ b/public/edouard_philippe_biographie.docx
@@ -5839,7 +5839,159 @@
         <w:pStyle w:val="Heading2"/>
       </w:pPr>
       <w:r>
-        <w:t xml:space="preserve">7. Nœuds de convergence et analyse structurelle</w:t>
+        <w:t xml:space="preserve">7. Le groupe Bilderberg : le cercle transatlantique des élites (depuis 2015)</w:t>
+      </w:r>
+    </w:p>
+    <w:p>
+      <w:pPr>
+        <w:pStyle w:val="Heading3"/>
+      </w:pPr>
+      <w:r>
+        <w:t xml:space="preserve">Présentation du cercle</w:t>
+      </w:r>
+    </w:p>
+    <w:p>
+      <w:pPr>
+        <w:spacing w:after="120" w:line="276"/>
+        <w:jc w:val="both"/>
+      </w:pPr>
+      <w:r>
+        <w:rPr>
+          <w:rFonts w:ascii="Georgia" w:cs="Georgia" w:eastAsia="Georgia" w:hAnsi="Georgia"/>
+          <w:sz w:val="22"/>
+          <w:szCs w:val="22"/>
+        </w:rPr>
+        <w:t xml:space="preserve">Le groupe Bilderberg, fondé en 1954, réunit chaque année pendant trois à quatre jours 120 à 140 dirigeants politiques, économiques, financiers, médiatiques et académiques d’Europe et d’Amérique du Nord. La règle de Chatham House s’applique : les participants sont libres d’utiliser les informations reçues, mais ne peuvent révéler l’identité des intervenants. Aucun vote, aucune résolution, aucun communiqué de politique officielle n’est publié. Le comité directeur sélectionne les thèmes et les participants.</w:t>
+      </w:r>
+    </w:p>
+    <w:p>
+      <w:pPr>
+        <w:pStyle w:val="Heading3"/>
+      </w:pPr>
+      <w:r>
+        <w:t xml:space="preserve">Cinq participations documentées d’Édouard Philippe</w:t>
+      </w:r>
+    </w:p>
+    <w:p>
+      <w:pPr>
+        <w:spacing w:after="120" w:line="276"/>
+        <w:jc w:val="both"/>
+      </w:pPr>
+      <w:r>
+        <w:rPr>
+          <w:rFonts w:ascii="Georgia" w:cs="Georgia" w:eastAsia="Georgia" w:hAnsi="Georgia"/>
+          <w:sz w:val="22"/>
+          <w:szCs w:val="22"/>
+        </w:rPr>
+        <w:t xml:space="preserve">2015, Telfs-Buchen (Autriche), 11-14 juin : 63ème conférence. Philippe est invité comme « Maire du Havre ». Henri de Castries, PDG d’AXA et président du comité directeur Bilderberg, confirme au JDD : « C’est moi qui l’ai proposé. Comme maire, il avait développé des idées intéressantes. » Parmi les co-participants : Alain Juppé, Henry Kissinger, Peter Thiel (Palantir), Demis Hassabis (Google DeepMind), les PDG de BP, Shell, Lazard, BlackRock, LinkedIn, un ancien patron de la NSA.</w:t>
+      </w:r>
+    </w:p>
+    <w:p>
+      <w:pPr>
+        <w:spacing w:after="120" w:line="276"/>
+        <w:jc w:val="both"/>
+      </w:pPr>
+      <w:r>
+        <w:rPr>
+          <w:rFonts w:ascii="Georgia" w:cs="Georgia" w:eastAsia="Georgia" w:hAnsi="Georgia"/>
+          <w:sz w:val="22"/>
+          <w:szCs w:val="22"/>
+        </w:rPr>
+        <w:t xml:space="preserve">2016, Dresde (Allemagne), 9-12 juin : 64ème conférence. Philippe est de nouveau invité, aux côtés de Castries, Patricia Barbizet, Nicolas Baverez, Laurent Fabius, Christine Lagarde et Emmanuelle Charpentier. Onze mois plus tard, il est nommé Premier ministre.</w:t>
+      </w:r>
+    </w:p>
+    <w:p>
+      <w:pPr>
+        <w:spacing w:after="120" w:line="276"/>
+        <w:jc w:val="both"/>
+      </w:pPr>
+      <w:r>
+        <w:rPr>
+          <w:rFonts w:ascii="Georgia" w:cs="Georgia" w:eastAsia="Georgia" w:hAnsi="Georgia"/>
+          <w:sz w:val="22"/>
+          <w:szCs w:val="22"/>
+        </w:rPr>
+        <w:t xml:space="preserve">2023, Lisbonne (Portugal), 18-21 mai : 69ème conférence. Philippe participe comme « ancien Premier ministre, maire du Havre », aux côtés de Gabriel Attal, Clément Beaune, Bernard Émié (directeur de la DGSE), Henri de Castries, Patrick Pouyanné (TotalEnergies), Thomas Buberl (AXA), Antoine Gosset-Grainville (AXA), Valérie Baudson (Amundi), Patricia Barbizet. Thèmes : IA, Ukraine, Chine, énergie.</w:t>
+      </w:r>
+    </w:p>
+    <w:p>
+      <w:pPr>
+        <w:spacing w:after="120" w:line="276"/>
+        <w:jc w:val="both"/>
+      </w:pPr>
+      <w:r>
+        <w:rPr>
+          <w:rFonts w:ascii="Georgia" w:cs="Georgia" w:eastAsia="Georgia" w:hAnsi="Georgia"/>
+          <w:sz w:val="22"/>
+          <w:szCs w:val="22"/>
+        </w:rPr>
+        <w:t xml:space="preserve">2024, Madrid (Espagne), 30 mai-2 juin : 70ème conférence. FranceSoir note que Philippe est « un habitué du club avec au moins trois participations ». Sept Français présents. Thèmes : IA, avenir de la guerre, Ukraine, Moyen-Orient, climat, biologie.</w:t>
+      </w:r>
+    </w:p>
+    <w:p>
+      <w:pPr>
+        <w:spacing w:after="120" w:line="276"/>
+        <w:jc w:val="both"/>
+      </w:pPr>
+      <w:r>
+        <w:rPr>
+          <w:rFonts w:ascii="Georgia" w:cs="Georgia" w:eastAsia="Georgia" w:hAnsi="Georgia"/>
+          <w:sz w:val="22"/>
+          <w:szCs w:val="22"/>
+        </w:rPr>
+        <w:t xml:space="preserve">2025, Stockholm (Suède), 12-15 juin : 71ème conférence, au Grand Hôtel. Philippe participe aux côtés de Gabriel Attal, Nicolas Roche (SGDSN), Patrick Pouyanné (TotalEnergies), Jean Lemierre (BNP Paribas), Arthur Mensch (Mistral AI), Luis Vassy (Sciences Po). Thèmes : relations transatlantiques, Ukraine, prolifération, IA et sécurité nationale, dépeuplement. Peter Thiel et Alex Karp (Palantir) sont membres du comité de pilotage.</w:t>
+      </w:r>
+    </w:p>
+    <w:p>
+      <w:pPr>
+        <w:pStyle w:val="Heading3"/>
+      </w:pPr>
+      <w:r>
+        <w:t xml:space="preserve">Le nœud Henri de Castries</w:t>
+      </w:r>
+    </w:p>
+    <w:p>
+      <w:pPr>
+        <w:spacing w:after="120" w:line="276"/>
+        <w:jc w:val="both"/>
+      </w:pPr>
+      <w:r>
+        <w:rPr>
+          <w:rFonts w:ascii="Georgia" w:cs="Georgia" w:eastAsia="Georgia" w:hAnsi="Georgia"/>
+          <w:sz w:val="22"/>
+          <w:szCs w:val="22"/>
+        </w:rPr>
+        <w:t xml:space="preserve">Henri de Castries (PDG d’AXA 2000-2016, président de l’Institut Montaigne, président du comité directeur Bilderberg) est le chaînon commun entre Macron et Philippe dans ce cercle. Il coopte Macron en 2014 (alors secrétaire général adjoint de l’Élysée) puis Philippe en 2015-2016. Le JDD rapporte que sept futurs ou anciens Premiers ministres français ont participé au Bilderberg : Fabius, Juppé, Rocard, Villepin, Fillon, Valls et Philippe. AXA figure par ailleurs parmi les partenaires du comité stratégique de la France China Foundation, ce qui en fait un nœud reliant deux cercles d’influence distincts.</w:t>
+      </w:r>
+    </w:p>
+    <w:p>
+      <w:pPr>
+        <w:pStyle w:val="Heading3"/>
+      </w:pPr>
+      <w:r>
+        <w:t xml:space="preserve">La question de l’élévation post-Bilderberg</w:t>
+      </w:r>
+    </w:p>
+    <w:p>
+      <w:pPr>
+        <w:spacing w:after="120" w:line="276"/>
+        <w:jc w:val="both"/>
+      </w:pPr>
+      <w:r>
+        <w:rPr>
+          <w:rFonts w:ascii="Georgia" w:cs="Georgia" w:eastAsia="Georgia" w:hAnsi="Georgia"/>
+          <w:sz w:val="22"/>
+          <w:szCs w:val="22"/>
+        </w:rPr>
+        <w:t xml:space="preserve">FranceSoir observe un schéma récurrent : plusieurs participants accèdent à des fonctions élevées peu après leur cooptation — Herman Van Rompuy (président du Conseil européen), Emmanuel Macron (ministre de l’Économie deux mois après sa participation de 2014), Édouard Philippe (Premier ministre onze mois après Dresde 2016). Le magazine Regards note sans valider la thèse complotiste : « Contrairement à ce que disent les complotistes, le groupe de Bilderberg ne choisit pas les dirigeants des pays occidentaux. Mais les hommes et femmes politiques qui sont invités peuvent y trouver un moyen pour être mieux connus et pour mettre en valeur leurs capacités personnelles. » La question posée par la députée européenne Virginie Joron au Parlement européen (E-001703/2023) sur la participation de commissaires européens au Bilderberg 2023 confirme que la transparence de ce cercle fait débat au niveau institutionnel.</w:t>
+      </w:r>
+    </w:p>
+    <w:p>
+      <w:pPr>
+        <w:pStyle w:val="Heading2"/>
+      </w:pPr>
+      <w:r>
+        <w:t xml:space="preserve">8. Nœuds de convergence et analyse structurelle</w:t>
       </w:r>
     </w:p>
     <w:p>
@@ -5949,7 +6101,7 @@
         <w:pStyle w:val="Heading2"/>
       </w:pPr>
       <w:r>
-        <w:t xml:space="preserve">8. Sources du chapitre Réseaux</w:t>
+        <w:t xml:space="preserve">9. Sources du chapitre Réseaux</w:t>
       </w:r>
     </w:p>
     <w:p>

</xml_diff>

<commit_message>
feat: bulletin 2 avril 2026 — corrections médias + nœud La Tribune dimanche
- 4 rapports .docx mis à jour (9 corrections du bulletin) :
  • biographie : entrées Mediapart/Blast enrichies (financement détaillé),
    note méthodologique révisée, Europe 1 caractérisée (Vivendi/Bolloré),
    table cartographie médiatique insérée (11 médias, lecture MAS)
  • coalition_2027 : CNews et Le Figaro caractérisés (propriétaire/orientation)
  • bilan_fiscal : Europe 1 et CNews caractérisés (Vivendi/Bolloré)
  • sondages_medias : Europe 1 + Figaro + AFP caractérisés + note analytique

- Nouveau nœud réseau : la-tribune-dimanche (CMA Médias/Saadé)
  Tribune des 90 (29/03/2026) + sondage Elabe commandité
  Traduit en 7 langues (en, de, es, ru, ja, it, zh)

Co-Authored-By: Claude Sonnet 4.6 <noreply@anthropic.com>
</commit_message>
<xml_diff>
--- a/public/edouard_philippe_biographie.docx
+++ b/public/edouard_philippe_biographie.docx
@@ -6279,7 +6279,7 @@
           <w:sz w:val="22"/>
           <w:szCs w:val="22"/>
         </w:rPr>
-        <w:t xml:space="preserve">• Mediapart — enquête sur la composition du cabinet Philippe à Matignon (cercle d’intimes Juppé, partage de conseillers Élysée/Matignon). Source indépendante, investigatrice.</w:t>
+        <w:t xml:space="preserve">• Mediapart — enquête sur la composition du cabinet Philippe à Matignon (cercle d’intimes Juppé, partage de conseillers Élysée/Matignon). Source investigatrice. Financement : 95 % par abonnements (~220 000 abonnés), sans publicité. Capital détenu depuis 2019 par le Fonds pour une presse libre (FPL), organisme à but non lucratif. Ne perçoit plus de subventions publiques depuis 2010 (avait reçu 200 000 € de l’État en 2009). Investisseurs fondateurs : Xavier Niel (200 000 €), Maurice Lévy (Publicis), Stéphane Fouks (Euro RSCG). Classé à gauche.</w:t>
       </w:r>
     </w:p>
     <w:p>
@@ -6335,7 +6335,7 @@
           <w:sz w:val="22"/>
           <w:szCs w:val="22"/>
         </w:rPr>
-        <w:t xml:space="preserve">• Europe 1 — article sur la nomination Philippe chez Atos, liens Juppé-Philippe à Bordeaux.</w:t>
+        <w:t xml:space="preserve">• Europe 1 — article sur la nomination Philippe chez Atos, liens Juppé-Philippe à Bordeaux. Groupe Vivendi (Vincent Bolloré). Ligne éditoriale droite conservatrice, non alignée avec la Macronie.</w:t>
       </w:r>
     </w:p>
     <w:p>
@@ -6427,7 +6427,7 @@
           <w:sz w:val="22"/>
           <w:szCs w:val="22"/>
         </w:rPr>
-        <w:t xml:space="preserve">• Blast (blast-info.fr) — enquête « Pantouflage : les bonnes affaires d’Édouard Philippe » : liens Atos depuis 2006, mission Walrafen, lien Breton. Source indépendante, investigatrice.</w:t>
+        <w:t xml:space="preserve">• Blast (blast-info.fr) — enquête « Pantouflage : les bonnes affaires d’Édouard Philippe » : liens Atos depuis 2006, mission Walrafen, lien Breton. Source investigatrice. Financement : entreprise de presse à but non lucratif fondée en 2021 par Denis Robert, financée par crowdfunding (620 000 € levés en un mois), abonnements et dons. A reçu 803 000 € d’aide publique au pluralisme de la presse en ligne (au titre de 2021-2022, source Acrimed/ministère de la Culture). Cofondateurs notables : David Dufresne, Élise Van Beneden (présidente Anticor), Salomé Saqué. A refusé le mécénat privé après polémique Vinciguerra (2021). Classé à gauche.</w:t>
       </w:r>
     </w:p>
     <w:p>
@@ -6477,7 +6477,1765 @@
           <w:sz w:val="22"/>
           <w:szCs w:val="22"/>
         </w:rPr>
-        <w:t xml:space="preserve">Les sources institutionnelles (FAF, FCF, gouvernement) sont par nature promotionnelles ou officielles. Les grandes encyclopédies (Wikipedia, Grokipedia, Universalis) offrent une base factuelle mais avec des biais de couverture. Les sources critiques proviennent de l’extrême gauche (Révolution Permanente), de la droite identitaire (Polémia), de médias anti-PCC (Epoch Times) ou de médias indépendants (Blast, Mediapart). Leur convergence factuelle sur les listes de membres, les dates et les connexions renforce la fiabilité des données, même si leurs interprétations divergent. Les données HATVP sont légalement publiques et vérifiables.</w:t>
+        <w:t xml:space="preserve">Les sources institutionnelles (FAF, FCF, gouvernement) sont par nature promotionnelles ou officielles. Les grandes encyclopédies (Wikipedia, Grokipedia, Universalis) offrent une base factuelle mais avec des biais de couverture. Les sources critiques proviennent de l’extrême gauche (Révolution Permanente), de la droite identitaire (Polémia), de médias anti-PCC (Epoch Times) ou de médias indépendants (Blast, Mediapart). Ces deux derniers sont bien indépendants au sens actionnarial : Mediapart est détenu par un fonds de dotation à but non lucratif (FPL) et financé à 95 % par ses abonnés ; Blast est une entreprise de presse à but non lucratif financée par crowdfunding et abonnements. Toutefois, cette indépendance actionnariale ne signifie pas absence de financement public : Blast a reçu 803 000 € d’aide publique au pluralisme (2021-2022) et Mediapart a bénéficié de 200 000 € de subventions en 2009 avant d’y renoncer. À titre de comparaison, BFMTV (CMA CGM/Saadé) perçoit des aides à la presse bien supérieures. Leur convergence factuelle sur les listes de membres, les dates et les connexions renforce la fiabilité des données, même si leurs interprétations (classées à gauche) divergent des sources de droite. Les données HATVP sont légalement publiques et vérifiables.</w:t>
+      </w:r>
+    </w:p>
+    <w:p>
+      <w:pPr>
+        <w:pStyle w:val="Heading3"/>
+      </w:pPr>
+      <w:r>
+        <w:t xml:space="preserve">Cartographie de la propriété médiatique (sources utilisées)</w:t>
+      </w:r>
+    </w:p>
+    <w:tbl>
+      <w:tblPr>
+        <w:tblW w:type="dxa" w:w="9306"/>
+        <w:tblBorders>
+          <w:top w:val="single" w:color="auto" w:sz="4"/>
+          <w:left w:val="single" w:color="auto" w:sz="4"/>
+          <w:bottom w:val="single" w:color="auto" w:sz="4"/>
+          <w:right w:val="single" w:color="auto" w:sz="4"/>
+          <w:insideH w:val="single" w:color="auto" w:sz="4"/>
+          <w:insideV w:val="single" w:color="auto" w:sz="4"/>
+        </w:tblBorders>
+      </w:tblPr>
+      <w:tblGrid>
+        <w:gridCol w:w="1500"/>
+        <w:gridCol w:w="2006"/>
+        <w:gridCol w:w="1600"/>
+        <w:gridCol w:w="2200"/>
+        <w:gridCol w:w="2000"/>
+      </w:tblGrid>
+      <w:tr>
+        <w:tc>
+          <w:tcPr>
+            <w:tcW w:type="dxa" w:w="1500"/>
+            <w:tcBorders>
+              <w:top w:val="single" w:color="AAAAAA" w:sz="1"/>
+              <w:left w:val="single" w:color="AAAAAA" w:sz="1"/>
+              <w:bottom w:val="single" w:color="AAAAAA" w:sz="1"/>
+              <w:right w:val="single" w:color="AAAAAA" w:sz="1"/>
+            </w:tcBorders>
+            <w:shd w:fill="E8EDF2" w:val="clear"/>
+            <w:tcMar>
+              <w:top w:type="dxa" w:w="60"/>
+              <w:left w:type="dxa" w:w="100"/>
+              <w:bottom w:type="dxa" w:w="60"/>
+              <w:right w:type="dxa" w:w="100"/>
+            </w:tcMar>
+          </w:tcPr>
+          <w:p>
+            <w:r>
+              <w:rPr>
+                <w:rFonts w:ascii="Arial" w:cs="Arial" w:eastAsia="Arial" w:hAnsi="Arial"/>
+                <w:b/>
+                <w:bCs/>
+                <w:sz w:val="18"/>
+                <w:szCs w:val="18"/>
+              </w:rPr>
+              <w:t xml:space="preserve">Média</w:t>
+            </w:r>
+          </w:p>
+        </w:tc>
+        <w:tc>
+          <w:tcPr>
+            <w:tcW w:type="dxa" w:w="2006"/>
+            <w:tcBorders>
+              <w:top w:val="single" w:color="AAAAAA" w:sz="1"/>
+              <w:left w:val="single" w:color="AAAAAA" w:sz="1"/>
+              <w:bottom w:val="single" w:color="AAAAAA" w:sz="1"/>
+              <w:right w:val="single" w:color="AAAAAA" w:sz="1"/>
+            </w:tcBorders>
+            <w:shd w:fill="E8EDF2" w:val="clear"/>
+            <w:tcMar>
+              <w:top w:type="dxa" w:w="60"/>
+              <w:left w:type="dxa" w:w="100"/>
+              <w:bottom w:type="dxa" w:w="60"/>
+              <w:right w:type="dxa" w:w="100"/>
+            </w:tcMar>
+          </w:tcPr>
+          <w:p>
+            <w:r>
+              <w:rPr>
+                <w:rFonts w:ascii="Arial" w:cs="Arial" w:eastAsia="Arial" w:hAnsi="Arial"/>
+                <w:b/>
+                <w:bCs/>
+                <w:sz w:val="18"/>
+                <w:szCs w:val="18"/>
+              </w:rPr>
+              <w:t xml:space="preserve">Propriétaire</w:t>
+            </w:r>
+          </w:p>
+        </w:tc>
+        <w:tc>
+          <w:tcPr>
+            <w:tcW w:type="dxa" w:w="1600"/>
+            <w:tcBorders>
+              <w:top w:val="single" w:color="AAAAAA" w:sz="1"/>
+              <w:left w:val="single" w:color="AAAAAA" w:sz="1"/>
+              <w:bottom w:val="single" w:color="AAAAAA" w:sz="1"/>
+              <w:right w:val="single" w:color="AAAAAA" w:sz="1"/>
+            </w:tcBorders>
+            <w:shd w:fill="E8EDF2" w:val="clear"/>
+            <w:tcMar>
+              <w:top w:type="dxa" w:w="60"/>
+              <w:left w:type="dxa" w:w="100"/>
+              <w:bottom w:type="dxa" w:w="60"/>
+              <w:right w:type="dxa" w:w="100"/>
+            </w:tcMar>
+          </w:tcPr>
+          <w:p>
+            <w:r>
+              <w:rPr>
+                <w:rFonts w:ascii="Arial" w:cs="Arial" w:eastAsia="Arial" w:hAnsi="Arial"/>
+                <w:b/>
+                <w:bCs/>
+                <w:sz w:val="18"/>
+                <w:szCs w:val="18"/>
+              </w:rPr>
+              <w:t xml:space="preserve">Orientation</w:t>
+            </w:r>
+          </w:p>
+        </w:tc>
+        <w:tc>
+          <w:tcPr>
+            <w:tcW w:type="dxa" w:w="2200"/>
+            <w:tcBorders>
+              <w:top w:val="single" w:color="AAAAAA" w:sz="1"/>
+              <w:left w:val="single" w:color="AAAAAA" w:sz="1"/>
+              <w:bottom w:val="single" w:color="AAAAAA" w:sz="1"/>
+              <w:right w:val="single" w:color="AAAAAA" w:sz="1"/>
+            </w:tcBorders>
+            <w:shd w:fill="E8EDF2" w:val="clear"/>
+            <w:tcMar>
+              <w:top w:type="dxa" w:w="60"/>
+              <w:left w:type="dxa" w:w="100"/>
+              <w:bottom w:type="dxa" w:w="60"/>
+              <w:right w:type="dxa" w:w="100"/>
+            </w:tcMar>
+          </w:tcPr>
+          <w:p>
+            <w:r>
+              <w:rPr>
+                <w:rFonts w:ascii="Arial" w:cs="Arial" w:eastAsia="Arial" w:hAnsi="Arial"/>
+                <w:b/>
+                <w:bCs/>
+                <w:sz w:val="18"/>
+                <w:szCs w:val="18"/>
+              </w:rPr>
+              <w:t xml:space="preserve">Financement clé</w:t>
+            </w:r>
+          </w:p>
+        </w:tc>
+        <w:tc>
+          <w:tcPr>
+            <w:tcW w:type="dxa" w:w="2000"/>
+            <w:tcBorders>
+              <w:top w:val="single" w:color="AAAAAA" w:sz="1"/>
+              <w:left w:val="single" w:color="AAAAAA" w:sz="1"/>
+              <w:bottom w:val="single" w:color="AAAAAA" w:sz="1"/>
+              <w:right w:val="single" w:color="AAAAAA" w:sz="1"/>
+            </w:tcBorders>
+            <w:shd w:fill="E8EDF2" w:val="clear"/>
+            <w:tcMar>
+              <w:top w:type="dxa" w:w="60"/>
+              <w:left w:type="dxa" w:w="100"/>
+              <w:bottom w:type="dxa" w:w="60"/>
+              <w:right w:type="dxa" w:w="100"/>
+            </w:tcMar>
+          </w:tcPr>
+          <w:p>
+            <w:r>
+              <w:rPr>
+                <w:rFonts w:ascii="Arial" w:cs="Arial" w:eastAsia="Arial" w:hAnsi="Arial"/>
+                <w:b/>
+                <w:bCs/>
+                <w:sz w:val="18"/>
+                <w:szCs w:val="18"/>
+              </w:rPr>
+              <w:t xml:space="preserve">Position / Philippe</w:t>
+            </w:r>
+          </w:p>
+        </w:tc>
+      </w:tr>
+      <w:tr>
+        <w:tc>
+          <w:tcPr>
+            <w:tcW w:type="dxa" w:w="1500"/>
+            <w:tcBorders>
+              <w:top w:val="single" w:color="AAAAAA" w:sz="1"/>
+              <w:left w:val="single" w:color="AAAAAA" w:sz="1"/>
+              <w:bottom w:val="single" w:color="AAAAAA" w:sz="1"/>
+              <w:right w:val="single" w:color="AAAAAA" w:sz="1"/>
+            </w:tcBorders>
+            <w:shd w:fill="FFFFFF" w:val="clear"/>
+            <w:tcMar>
+              <w:top w:type="dxa" w:w="60"/>
+              <w:left w:type="dxa" w:w="100"/>
+              <w:bottom w:type="dxa" w:w="60"/>
+              <w:right w:type="dxa" w:w="100"/>
+            </w:tcMar>
+          </w:tcPr>
+          <w:p>
+            <w:r>
+              <w:rPr>
+                <w:rFonts w:ascii="Arial" w:cs="Arial" w:eastAsia="Arial" w:hAnsi="Arial"/>
+                <w:sz w:val="18"/>
+                <w:szCs w:val="18"/>
+              </w:rPr>
+              <w:t xml:space="preserve">BFMTV / RMC</w:t>
+            </w:r>
+          </w:p>
+        </w:tc>
+        <w:tc>
+          <w:tcPr>
+            <w:tcW w:type="dxa" w:w="2006"/>
+            <w:tcBorders>
+              <w:top w:val="single" w:color="AAAAAA" w:sz="1"/>
+              <w:left w:val="single" w:color="AAAAAA" w:sz="1"/>
+              <w:bottom w:val="single" w:color="AAAAAA" w:sz="1"/>
+              <w:right w:val="single" w:color="AAAAAA" w:sz="1"/>
+            </w:tcBorders>
+            <w:shd w:fill="FFFFFF" w:val="clear"/>
+            <w:tcMar>
+              <w:top w:type="dxa" w:w="60"/>
+              <w:left w:type="dxa" w:w="100"/>
+              <w:bottom w:type="dxa" w:w="60"/>
+              <w:right w:type="dxa" w:w="100"/>
+            </w:tcMar>
+          </w:tcPr>
+          <w:p>
+            <w:r>
+              <w:rPr>
+                <w:rFonts w:ascii="Arial" w:cs="Arial" w:eastAsia="Arial" w:hAnsi="Arial"/>
+                <w:sz w:val="18"/>
+                <w:szCs w:val="18"/>
+              </w:rPr>
+              <w:t xml:space="preserve">CMA CGM (R. Saadé)</w:t>
+            </w:r>
+          </w:p>
+        </w:tc>
+        <w:tc>
+          <w:tcPr>
+            <w:tcW w:type="dxa" w:w="1600"/>
+            <w:tcBorders>
+              <w:top w:val="single" w:color="AAAAAA" w:sz="1"/>
+              <w:left w:val="single" w:color="AAAAAA" w:sz="1"/>
+              <w:bottom w:val="single" w:color="AAAAAA" w:sz="1"/>
+              <w:right w:val="single" w:color="AAAAAA" w:sz="1"/>
+            </w:tcBorders>
+            <w:shd w:fill="FFFFFF" w:val="clear"/>
+            <w:tcMar>
+              <w:top w:type="dxa" w:w="60"/>
+              <w:left w:type="dxa" w:w="100"/>
+              <w:bottom w:type="dxa" w:w="60"/>
+              <w:right w:type="dxa" w:w="100"/>
+            </w:tcMar>
+          </w:tcPr>
+          <w:p>
+            <w:r>
+              <w:rPr>
+                <w:rFonts w:ascii="Arial" w:cs="Arial" w:eastAsia="Arial" w:hAnsi="Arial"/>
+                <w:sz w:val="18"/>
+                <w:szCs w:val="18"/>
+              </w:rPr>
+              <w:t xml:space="preserve">Centre-libéral</w:t>
+            </w:r>
+          </w:p>
+        </w:tc>
+        <w:tc>
+          <w:tcPr>
+            <w:tcW w:type="dxa" w:w="2200"/>
+            <w:tcBorders>
+              <w:top w:val="single" w:color="AAAAAA" w:sz="1"/>
+              <w:left w:val="single" w:color="AAAAAA" w:sz="1"/>
+              <w:bottom w:val="single" w:color="AAAAAA" w:sz="1"/>
+              <w:right w:val="single" w:color="AAAAAA" w:sz="1"/>
+            </w:tcBorders>
+            <w:shd w:fill="FFFFFF" w:val="clear"/>
+            <w:tcMar>
+              <w:top w:type="dxa" w:w="60"/>
+              <w:left w:type="dxa" w:w="100"/>
+              <w:bottom w:type="dxa" w:w="60"/>
+              <w:right w:type="dxa" w:w="100"/>
+            </w:tcMar>
+          </w:tcPr>
+          <w:p>
+            <w:r>
+              <w:rPr>
+                <w:rFonts w:ascii="Arial" w:cs="Arial" w:eastAsia="Arial" w:hAnsi="Arial"/>
+                <w:sz w:val="18"/>
+                <w:szCs w:val="18"/>
+              </w:rPr>
+              <w:t xml:space="preserve">Publicité + aides presse</w:t>
+            </w:r>
+          </w:p>
+        </w:tc>
+        <w:tc>
+          <w:tcPr>
+            <w:tcW w:type="dxa" w:w="2000"/>
+            <w:tcBorders>
+              <w:top w:val="single" w:color="AAAAAA" w:sz="1"/>
+              <w:left w:val="single" w:color="AAAAAA" w:sz="1"/>
+              <w:bottom w:val="single" w:color="AAAAAA" w:sz="1"/>
+              <w:right w:val="single" w:color="AAAAAA" w:sz="1"/>
+            </w:tcBorders>
+            <w:shd w:fill="FFFFFF" w:val="clear"/>
+            <w:tcMar>
+              <w:top w:type="dxa" w:w="60"/>
+              <w:left w:type="dxa" w:w="100"/>
+              <w:bottom w:type="dxa" w:w="60"/>
+              <w:right w:type="dxa" w:w="100"/>
+            </w:tcMar>
+          </w:tcPr>
+          <w:p>
+            <w:r>
+              <w:rPr>
+                <w:rFonts w:ascii="Arial" w:cs="Arial" w:eastAsia="Arial" w:hAnsi="Arial"/>
+                <w:sz w:val="18"/>
+                <w:szCs w:val="18"/>
+              </w:rPr>
+              <w:t xml:space="preserve">Favorable (hub Le Havre)</w:t>
+            </w:r>
+          </w:p>
+        </w:tc>
+      </w:tr>
+      <w:tr>
+        <w:tc>
+          <w:tcPr>
+            <w:tcW w:type="dxa" w:w="1500"/>
+            <w:tcBorders>
+              <w:top w:val="single" w:color="AAAAAA" w:sz="1"/>
+              <w:left w:val="single" w:color="AAAAAA" w:sz="1"/>
+              <w:bottom w:val="single" w:color="AAAAAA" w:sz="1"/>
+              <w:right w:val="single" w:color="AAAAAA" w:sz="1"/>
+            </w:tcBorders>
+            <w:shd w:fill="F5F5F5" w:val="clear"/>
+            <w:tcMar>
+              <w:top w:type="dxa" w:w="60"/>
+              <w:left w:type="dxa" w:w="100"/>
+              <w:bottom w:type="dxa" w:w="60"/>
+              <w:right w:type="dxa" w:w="100"/>
+            </w:tcMar>
+          </w:tcPr>
+          <w:p>
+            <w:r>
+              <w:rPr>
+                <w:rFonts w:ascii="Arial" w:cs="Arial" w:eastAsia="Arial" w:hAnsi="Arial"/>
+                <w:sz w:val="18"/>
+                <w:szCs w:val="18"/>
+              </w:rPr>
+              <w:t xml:space="preserve">La Tribune dim.</w:t>
+            </w:r>
+          </w:p>
+        </w:tc>
+        <w:tc>
+          <w:tcPr>
+            <w:tcW w:type="dxa" w:w="2006"/>
+            <w:tcBorders>
+              <w:top w:val="single" w:color="AAAAAA" w:sz="1"/>
+              <w:left w:val="single" w:color="AAAAAA" w:sz="1"/>
+              <w:bottom w:val="single" w:color="AAAAAA" w:sz="1"/>
+              <w:right w:val="single" w:color="AAAAAA" w:sz="1"/>
+            </w:tcBorders>
+            <w:shd w:fill="F5F5F5" w:val="clear"/>
+            <w:tcMar>
+              <w:top w:type="dxa" w:w="60"/>
+              <w:left w:type="dxa" w:w="100"/>
+              <w:bottom w:type="dxa" w:w="60"/>
+              <w:right w:type="dxa" w:w="100"/>
+            </w:tcMar>
+          </w:tcPr>
+          <w:p>
+            <w:r>
+              <w:rPr>
+                <w:rFonts w:ascii="Arial" w:cs="Arial" w:eastAsia="Arial" w:hAnsi="Arial"/>
+                <w:sz w:val="18"/>
+                <w:szCs w:val="18"/>
+              </w:rPr>
+              <w:t xml:space="preserve">CMA Médias (Saadé)</w:t>
+            </w:r>
+          </w:p>
+        </w:tc>
+        <w:tc>
+          <w:tcPr>
+            <w:tcW w:type="dxa" w:w="1600"/>
+            <w:tcBorders>
+              <w:top w:val="single" w:color="AAAAAA" w:sz="1"/>
+              <w:left w:val="single" w:color="AAAAAA" w:sz="1"/>
+              <w:bottom w:val="single" w:color="AAAAAA" w:sz="1"/>
+              <w:right w:val="single" w:color="AAAAAA" w:sz="1"/>
+            </w:tcBorders>
+            <w:shd w:fill="F5F5F5" w:val="clear"/>
+            <w:tcMar>
+              <w:top w:type="dxa" w:w="60"/>
+              <w:left w:type="dxa" w:w="100"/>
+              <w:bottom w:type="dxa" w:w="60"/>
+              <w:right w:type="dxa" w:w="100"/>
+            </w:tcMar>
+          </w:tcPr>
+          <w:p>
+            <w:r>
+              <w:rPr>
+                <w:rFonts w:ascii="Arial" w:cs="Arial" w:eastAsia="Arial" w:hAnsi="Arial"/>
+                <w:sz w:val="18"/>
+                <w:szCs w:val="18"/>
+              </w:rPr>
+              <w:t xml:space="preserve">Centre-libéral</w:t>
+            </w:r>
+          </w:p>
+        </w:tc>
+        <w:tc>
+          <w:tcPr>
+            <w:tcW w:type="dxa" w:w="2200"/>
+            <w:tcBorders>
+              <w:top w:val="single" w:color="AAAAAA" w:sz="1"/>
+              <w:left w:val="single" w:color="AAAAAA" w:sz="1"/>
+              <w:bottom w:val="single" w:color="AAAAAA" w:sz="1"/>
+              <w:right w:val="single" w:color="AAAAAA" w:sz="1"/>
+            </w:tcBorders>
+            <w:shd w:fill="F5F5F5" w:val="clear"/>
+            <w:tcMar>
+              <w:top w:type="dxa" w:w="60"/>
+              <w:left w:type="dxa" w:w="100"/>
+              <w:bottom w:type="dxa" w:w="60"/>
+              <w:right w:type="dxa" w:w="100"/>
+            </w:tcMar>
+          </w:tcPr>
+          <w:p>
+            <w:r>
+              <w:rPr>
+                <w:rFonts w:ascii="Arial" w:cs="Arial" w:eastAsia="Arial" w:hAnsi="Arial"/>
+                <w:sz w:val="18"/>
+                <w:szCs w:val="18"/>
+              </w:rPr>
+              <w:t xml:space="preserve">Publicité + aides presse</w:t>
+            </w:r>
+          </w:p>
+        </w:tc>
+        <w:tc>
+          <w:tcPr>
+            <w:tcW w:type="dxa" w:w="2000"/>
+            <w:tcBorders>
+              <w:top w:val="single" w:color="AAAAAA" w:sz="1"/>
+              <w:left w:val="single" w:color="AAAAAA" w:sz="1"/>
+              <w:bottom w:val="single" w:color="AAAAAA" w:sz="1"/>
+              <w:right w:val="single" w:color="AAAAAA" w:sz="1"/>
+            </w:tcBorders>
+            <w:shd w:fill="F5F5F5" w:val="clear"/>
+            <w:tcMar>
+              <w:top w:type="dxa" w:w="60"/>
+              <w:left w:type="dxa" w:w="100"/>
+              <w:bottom w:type="dxa" w:w="60"/>
+              <w:right w:type="dxa" w:w="100"/>
+            </w:tcMar>
+          </w:tcPr>
+          <w:p>
+            <w:r>
+              <w:rPr>
+                <w:rFonts w:ascii="Arial" w:cs="Arial" w:eastAsia="Arial" w:hAnsi="Arial"/>
+                <w:sz w:val="18"/>
+                <w:szCs w:val="18"/>
+              </w:rPr>
+              <w:t xml:space="preserve">A publié tribune 90</w:t>
+            </w:r>
+          </w:p>
+        </w:tc>
+      </w:tr>
+      <w:tr>
+        <w:tc>
+          <w:tcPr>
+            <w:tcW w:type="dxa" w:w="1500"/>
+            <w:tcBorders>
+              <w:top w:val="single" w:color="AAAAAA" w:sz="1"/>
+              <w:left w:val="single" w:color="AAAAAA" w:sz="1"/>
+              <w:bottom w:val="single" w:color="AAAAAA" w:sz="1"/>
+              <w:right w:val="single" w:color="AAAAAA" w:sz="1"/>
+            </w:tcBorders>
+            <w:shd w:fill="FFFFFF" w:val="clear"/>
+            <w:tcMar>
+              <w:top w:type="dxa" w:w="60"/>
+              <w:left w:type="dxa" w:w="100"/>
+              <w:bottom w:type="dxa" w:w="60"/>
+              <w:right w:type="dxa" w:w="100"/>
+            </w:tcMar>
+          </w:tcPr>
+          <w:p>
+            <w:r>
+              <w:rPr>
+                <w:rFonts w:ascii="Arial" w:cs="Arial" w:eastAsia="Arial" w:hAnsi="Arial"/>
+                <w:sz w:val="18"/>
+                <w:szCs w:val="18"/>
+              </w:rPr>
+              <w:t xml:space="preserve">CNews</w:t>
+            </w:r>
+          </w:p>
+        </w:tc>
+        <w:tc>
+          <w:tcPr>
+            <w:tcW w:type="dxa" w:w="2006"/>
+            <w:tcBorders>
+              <w:top w:val="single" w:color="AAAAAA" w:sz="1"/>
+              <w:left w:val="single" w:color="AAAAAA" w:sz="1"/>
+              <w:bottom w:val="single" w:color="AAAAAA" w:sz="1"/>
+              <w:right w:val="single" w:color="AAAAAA" w:sz="1"/>
+            </w:tcBorders>
+            <w:shd w:fill="FFFFFF" w:val="clear"/>
+            <w:tcMar>
+              <w:top w:type="dxa" w:w="60"/>
+              <w:left w:type="dxa" w:w="100"/>
+              <w:bottom w:type="dxa" w:w="60"/>
+              <w:right w:type="dxa" w:w="100"/>
+            </w:tcMar>
+          </w:tcPr>
+          <w:p>
+            <w:r>
+              <w:rPr>
+                <w:rFonts w:ascii="Arial" w:cs="Arial" w:eastAsia="Arial" w:hAnsi="Arial"/>
+                <w:sz w:val="18"/>
+                <w:szCs w:val="18"/>
+              </w:rPr>
+              <w:t xml:space="preserve">Vivendi (V. Bolloré)</w:t>
+            </w:r>
+          </w:p>
+        </w:tc>
+        <w:tc>
+          <w:tcPr>
+            <w:tcW w:type="dxa" w:w="1600"/>
+            <w:tcBorders>
+              <w:top w:val="single" w:color="AAAAAA" w:sz="1"/>
+              <w:left w:val="single" w:color="AAAAAA" w:sz="1"/>
+              <w:bottom w:val="single" w:color="AAAAAA" w:sz="1"/>
+              <w:right w:val="single" w:color="AAAAAA" w:sz="1"/>
+            </w:tcBorders>
+            <w:shd w:fill="FFFFFF" w:val="clear"/>
+            <w:tcMar>
+              <w:top w:type="dxa" w:w="60"/>
+              <w:left w:type="dxa" w:w="100"/>
+              <w:bottom w:type="dxa" w:w="60"/>
+              <w:right w:type="dxa" w:w="100"/>
+            </w:tcMar>
+          </w:tcPr>
+          <w:p>
+            <w:r>
+              <w:rPr>
+                <w:rFonts w:ascii="Arial" w:cs="Arial" w:eastAsia="Arial" w:hAnsi="Arial"/>
+                <w:sz w:val="18"/>
+                <w:szCs w:val="18"/>
+              </w:rPr>
+              <w:t xml:space="preserve">Droite dure</w:t>
+            </w:r>
+          </w:p>
+        </w:tc>
+        <w:tc>
+          <w:tcPr>
+            <w:tcW w:type="dxa" w:w="2200"/>
+            <w:tcBorders>
+              <w:top w:val="single" w:color="AAAAAA" w:sz="1"/>
+              <w:left w:val="single" w:color="AAAAAA" w:sz="1"/>
+              <w:bottom w:val="single" w:color="AAAAAA" w:sz="1"/>
+              <w:right w:val="single" w:color="AAAAAA" w:sz="1"/>
+            </w:tcBorders>
+            <w:shd w:fill="FFFFFF" w:val="clear"/>
+            <w:tcMar>
+              <w:top w:type="dxa" w:w="60"/>
+              <w:left w:type="dxa" w:w="100"/>
+              <w:bottom w:type="dxa" w:w="60"/>
+              <w:right w:type="dxa" w:w="100"/>
+            </w:tcMar>
+          </w:tcPr>
+          <w:p>
+            <w:r>
+              <w:rPr>
+                <w:rFonts w:ascii="Arial" w:cs="Arial" w:eastAsia="Arial" w:hAnsi="Arial"/>
+                <w:sz w:val="18"/>
+                <w:szCs w:val="18"/>
+              </w:rPr>
+              <w:t xml:space="preserve">Publicité + aides presse</w:t>
+            </w:r>
+          </w:p>
+        </w:tc>
+        <w:tc>
+          <w:tcPr>
+            <w:tcW w:type="dxa" w:w="2000"/>
+            <w:tcBorders>
+              <w:top w:val="single" w:color="AAAAAA" w:sz="1"/>
+              <w:left w:val="single" w:color="AAAAAA" w:sz="1"/>
+              <w:bottom w:val="single" w:color="AAAAAA" w:sz="1"/>
+              <w:right w:val="single" w:color="AAAAAA" w:sz="1"/>
+            </w:tcBorders>
+            <w:shd w:fill="FFFFFF" w:val="clear"/>
+            <w:tcMar>
+              <w:top w:type="dxa" w:w="60"/>
+              <w:left w:type="dxa" w:w="100"/>
+              <w:bottom w:type="dxa" w:w="60"/>
+              <w:right w:type="dxa" w:w="100"/>
+            </w:tcMar>
+          </w:tcPr>
+          <w:p>
+            <w:r>
+              <w:rPr>
+                <w:rFonts w:ascii="Arial" w:cs="Arial" w:eastAsia="Arial" w:hAnsi="Arial"/>
+                <w:sz w:val="18"/>
+                <w:szCs w:val="18"/>
+              </w:rPr>
+              <w:t xml:space="preserve">Adversaire (Zemmour)</w:t>
+            </w:r>
+          </w:p>
+        </w:tc>
+      </w:tr>
+      <w:tr>
+        <w:tc>
+          <w:tcPr>
+            <w:tcW w:type="dxa" w:w="1500"/>
+            <w:tcBorders>
+              <w:top w:val="single" w:color="AAAAAA" w:sz="1"/>
+              <w:left w:val="single" w:color="AAAAAA" w:sz="1"/>
+              <w:bottom w:val="single" w:color="AAAAAA" w:sz="1"/>
+              <w:right w:val="single" w:color="AAAAAA" w:sz="1"/>
+            </w:tcBorders>
+            <w:shd w:fill="F5F5F5" w:val="clear"/>
+            <w:tcMar>
+              <w:top w:type="dxa" w:w="60"/>
+              <w:left w:type="dxa" w:w="100"/>
+              <w:bottom w:type="dxa" w:w="60"/>
+              <w:right w:type="dxa" w:w="100"/>
+            </w:tcMar>
+          </w:tcPr>
+          <w:p>
+            <w:r>
+              <w:rPr>
+                <w:rFonts w:ascii="Arial" w:cs="Arial" w:eastAsia="Arial" w:hAnsi="Arial"/>
+                <w:sz w:val="18"/>
+                <w:szCs w:val="18"/>
+              </w:rPr>
+              <w:t xml:space="preserve">Europe 1</w:t>
+            </w:r>
+          </w:p>
+        </w:tc>
+        <w:tc>
+          <w:tcPr>
+            <w:tcW w:type="dxa" w:w="2006"/>
+            <w:tcBorders>
+              <w:top w:val="single" w:color="AAAAAA" w:sz="1"/>
+              <w:left w:val="single" w:color="AAAAAA" w:sz="1"/>
+              <w:bottom w:val="single" w:color="AAAAAA" w:sz="1"/>
+              <w:right w:val="single" w:color="AAAAAA" w:sz="1"/>
+            </w:tcBorders>
+            <w:shd w:fill="F5F5F5" w:val="clear"/>
+            <w:tcMar>
+              <w:top w:type="dxa" w:w="60"/>
+              <w:left w:type="dxa" w:w="100"/>
+              <w:bottom w:type="dxa" w:w="60"/>
+              <w:right w:type="dxa" w:w="100"/>
+            </w:tcMar>
+          </w:tcPr>
+          <w:p>
+            <w:r>
+              <w:rPr>
+                <w:rFonts w:ascii="Arial" w:cs="Arial" w:eastAsia="Arial" w:hAnsi="Arial"/>
+                <w:sz w:val="18"/>
+                <w:szCs w:val="18"/>
+              </w:rPr>
+              <w:t xml:space="preserve">Vivendi (V. Bolloré)</w:t>
+            </w:r>
+          </w:p>
+        </w:tc>
+        <w:tc>
+          <w:tcPr>
+            <w:tcW w:type="dxa" w:w="1600"/>
+            <w:tcBorders>
+              <w:top w:val="single" w:color="AAAAAA" w:sz="1"/>
+              <w:left w:val="single" w:color="AAAAAA" w:sz="1"/>
+              <w:bottom w:val="single" w:color="AAAAAA" w:sz="1"/>
+              <w:right w:val="single" w:color="AAAAAA" w:sz="1"/>
+            </w:tcBorders>
+            <w:shd w:fill="F5F5F5" w:val="clear"/>
+            <w:tcMar>
+              <w:top w:type="dxa" w:w="60"/>
+              <w:left w:type="dxa" w:w="100"/>
+              <w:bottom w:type="dxa" w:w="60"/>
+              <w:right w:type="dxa" w:w="100"/>
+            </w:tcMar>
+          </w:tcPr>
+          <w:p>
+            <w:r>
+              <w:rPr>
+                <w:rFonts w:ascii="Arial" w:cs="Arial" w:eastAsia="Arial" w:hAnsi="Arial"/>
+                <w:sz w:val="18"/>
+                <w:szCs w:val="18"/>
+              </w:rPr>
+              <w:t xml:space="preserve">Droite conserv.</w:t>
+            </w:r>
+          </w:p>
+        </w:tc>
+        <w:tc>
+          <w:tcPr>
+            <w:tcW w:type="dxa" w:w="2200"/>
+            <w:tcBorders>
+              <w:top w:val="single" w:color="AAAAAA" w:sz="1"/>
+              <w:left w:val="single" w:color="AAAAAA" w:sz="1"/>
+              <w:bottom w:val="single" w:color="AAAAAA" w:sz="1"/>
+              <w:right w:val="single" w:color="AAAAAA" w:sz="1"/>
+            </w:tcBorders>
+            <w:shd w:fill="F5F5F5" w:val="clear"/>
+            <w:tcMar>
+              <w:top w:type="dxa" w:w="60"/>
+              <w:left w:type="dxa" w:w="100"/>
+              <w:bottom w:type="dxa" w:w="60"/>
+              <w:right w:type="dxa" w:w="100"/>
+            </w:tcMar>
+          </w:tcPr>
+          <w:p>
+            <w:r>
+              <w:rPr>
+                <w:rFonts w:ascii="Arial" w:cs="Arial" w:eastAsia="Arial" w:hAnsi="Arial"/>
+                <w:sz w:val="18"/>
+                <w:szCs w:val="18"/>
+              </w:rPr>
+              <w:t xml:space="preserve">Publicité + aides presse</w:t>
+            </w:r>
+          </w:p>
+        </w:tc>
+        <w:tc>
+          <w:tcPr>
+            <w:tcW w:type="dxa" w:w="2000"/>
+            <w:tcBorders>
+              <w:top w:val="single" w:color="AAAAAA" w:sz="1"/>
+              <w:left w:val="single" w:color="AAAAAA" w:sz="1"/>
+              <w:bottom w:val="single" w:color="AAAAAA" w:sz="1"/>
+              <w:right w:val="single" w:color="AAAAAA" w:sz="1"/>
+            </w:tcBorders>
+            <w:shd w:fill="F5F5F5" w:val="clear"/>
+            <w:tcMar>
+              <w:top w:type="dxa" w:w="60"/>
+              <w:left w:type="dxa" w:w="100"/>
+              <w:bottom w:type="dxa" w:w="60"/>
+              <w:right w:type="dxa" w:w="100"/>
+            </w:tcMar>
+          </w:tcPr>
+          <w:p>
+            <w:r>
+              <w:rPr>
+                <w:rFonts w:ascii="Arial" w:cs="Arial" w:eastAsia="Arial" w:hAnsi="Arial"/>
+                <w:sz w:val="18"/>
+                <w:szCs w:val="18"/>
+              </w:rPr>
+              <w:t xml:space="preserve">Adversaire (Bolloré)</w:t>
+            </w:r>
+          </w:p>
+        </w:tc>
+      </w:tr>
+      <w:tr>
+        <w:tc>
+          <w:tcPr>
+            <w:tcW w:type="dxa" w:w="1500"/>
+            <w:tcBorders>
+              <w:top w:val="single" w:color="AAAAAA" w:sz="1"/>
+              <w:left w:val="single" w:color="AAAAAA" w:sz="1"/>
+              <w:bottom w:val="single" w:color="AAAAAA" w:sz="1"/>
+              <w:right w:val="single" w:color="AAAAAA" w:sz="1"/>
+            </w:tcBorders>
+            <w:shd w:fill="FFFFFF" w:val="clear"/>
+            <w:tcMar>
+              <w:top w:type="dxa" w:w="60"/>
+              <w:left w:type="dxa" w:w="100"/>
+              <w:bottom w:type="dxa" w:w="60"/>
+              <w:right w:type="dxa" w:w="100"/>
+            </w:tcMar>
+          </w:tcPr>
+          <w:p>
+            <w:r>
+              <w:rPr>
+                <w:rFonts w:ascii="Arial" w:cs="Arial" w:eastAsia="Arial" w:hAnsi="Arial"/>
+                <w:sz w:val="18"/>
+                <w:szCs w:val="18"/>
+              </w:rPr>
+              <w:t xml:space="preserve">Le Figaro</w:t>
+            </w:r>
+          </w:p>
+        </w:tc>
+        <w:tc>
+          <w:tcPr>
+            <w:tcW w:type="dxa" w:w="2006"/>
+            <w:tcBorders>
+              <w:top w:val="single" w:color="AAAAAA" w:sz="1"/>
+              <w:left w:val="single" w:color="AAAAAA" w:sz="1"/>
+              <w:bottom w:val="single" w:color="AAAAAA" w:sz="1"/>
+              <w:right w:val="single" w:color="AAAAAA" w:sz="1"/>
+            </w:tcBorders>
+            <w:shd w:fill="FFFFFF" w:val="clear"/>
+            <w:tcMar>
+              <w:top w:type="dxa" w:w="60"/>
+              <w:left w:type="dxa" w:w="100"/>
+              <w:bottom w:type="dxa" w:w="60"/>
+              <w:right w:type="dxa" w:w="100"/>
+            </w:tcMar>
+          </w:tcPr>
+          <w:p>
+            <w:r>
+              <w:rPr>
+                <w:rFonts w:ascii="Arial" w:cs="Arial" w:eastAsia="Arial" w:hAnsi="Arial"/>
+                <w:sz w:val="18"/>
+                <w:szCs w:val="18"/>
+              </w:rPr>
+              <w:t xml:space="preserve">Grpe Dassault</w:t>
+            </w:r>
+          </w:p>
+        </w:tc>
+        <w:tc>
+          <w:tcPr>
+            <w:tcW w:type="dxa" w:w="1600"/>
+            <w:tcBorders>
+              <w:top w:val="single" w:color="AAAAAA" w:sz="1"/>
+              <w:left w:val="single" w:color="AAAAAA" w:sz="1"/>
+              <w:bottom w:val="single" w:color="AAAAAA" w:sz="1"/>
+              <w:right w:val="single" w:color="AAAAAA" w:sz="1"/>
+            </w:tcBorders>
+            <w:shd w:fill="FFFFFF" w:val="clear"/>
+            <w:tcMar>
+              <w:top w:type="dxa" w:w="60"/>
+              <w:left w:type="dxa" w:w="100"/>
+              <w:bottom w:type="dxa" w:w="60"/>
+              <w:right w:type="dxa" w:w="100"/>
+            </w:tcMar>
+          </w:tcPr>
+          <w:p>
+            <w:r>
+              <w:rPr>
+                <w:rFonts w:ascii="Arial" w:cs="Arial" w:eastAsia="Arial" w:hAnsi="Arial"/>
+                <w:sz w:val="18"/>
+                <w:szCs w:val="18"/>
+              </w:rPr>
+              <w:t xml:space="preserve">Centre-droit</w:t>
+            </w:r>
+          </w:p>
+        </w:tc>
+        <w:tc>
+          <w:tcPr>
+            <w:tcW w:type="dxa" w:w="2200"/>
+            <w:tcBorders>
+              <w:top w:val="single" w:color="AAAAAA" w:sz="1"/>
+              <w:left w:val="single" w:color="AAAAAA" w:sz="1"/>
+              <w:bottom w:val="single" w:color="AAAAAA" w:sz="1"/>
+              <w:right w:val="single" w:color="AAAAAA" w:sz="1"/>
+            </w:tcBorders>
+            <w:shd w:fill="FFFFFF" w:val="clear"/>
+            <w:tcMar>
+              <w:top w:type="dxa" w:w="60"/>
+              <w:left w:type="dxa" w:w="100"/>
+              <w:bottom w:type="dxa" w:w="60"/>
+              <w:right w:type="dxa" w:w="100"/>
+            </w:tcMar>
+          </w:tcPr>
+          <w:p>
+            <w:r>
+              <w:rPr>
+                <w:rFonts w:ascii="Arial" w:cs="Arial" w:eastAsia="Arial" w:hAnsi="Arial"/>
+                <w:sz w:val="18"/>
+                <w:szCs w:val="18"/>
+              </w:rPr>
+              <w:t xml:space="preserve">Abonn. + pub + aides</w:t>
+            </w:r>
+          </w:p>
+        </w:tc>
+        <w:tc>
+          <w:tcPr>
+            <w:tcW w:type="dxa" w:w="2000"/>
+            <w:tcBorders>
+              <w:top w:val="single" w:color="AAAAAA" w:sz="1"/>
+              <w:left w:val="single" w:color="AAAAAA" w:sz="1"/>
+              <w:bottom w:val="single" w:color="AAAAAA" w:sz="1"/>
+              <w:right w:val="single" w:color="AAAAAA" w:sz="1"/>
+            </w:tcBorders>
+            <w:shd w:fill="FFFFFF" w:val="clear"/>
+            <w:tcMar>
+              <w:top w:type="dxa" w:w="60"/>
+              <w:left w:type="dxa" w:w="100"/>
+              <w:bottom w:type="dxa" w:w="60"/>
+              <w:right w:type="dxa" w:w="100"/>
+            </w:tcMar>
+          </w:tcPr>
+          <w:p>
+            <w:r>
+              <w:rPr>
+                <w:rFonts w:ascii="Arial" w:cs="Arial" w:eastAsia="Arial" w:hAnsi="Arial"/>
+                <w:sz w:val="18"/>
+                <w:szCs w:val="18"/>
+              </w:rPr>
+              <w:t xml:space="preserve">Variable (Retailleau)</w:t>
+            </w:r>
+          </w:p>
+        </w:tc>
+      </w:tr>
+      <w:tr>
+        <w:tc>
+          <w:tcPr>
+            <w:tcW w:type="dxa" w:w="1500"/>
+            <w:tcBorders>
+              <w:top w:val="single" w:color="AAAAAA" w:sz="1"/>
+              <w:left w:val="single" w:color="AAAAAA" w:sz="1"/>
+              <w:bottom w:val="single" w:color="AAAAAA" w:sz="1"/>
+              <w:right w:val="single" w:color="AAAAAA" w:sz="1"/>
+            </w:tcBorders>
+            <w:shd w:fill="F5F5F5" w:val="clear"/>
+            <w:tcMar>
+              <w:top w:type="dxa" w:w="60"/>
+              <w:left w:type="dxa" w:w="100"/>
+              <w:bottom w:type="dxa" w:w="60"/>
+              <w:right w:type="dxa" w:w="100"/>
+            </w:tcMar>
+          </w:tcPr>
+          <w:p>
+            <w:r>
+              <w:rPr>
+                <w:rFonts w:ascii="Arial" w:cs="Arial" w:eastAsia="Arial" w:hAnsi="Arial"/>
+                <w:sz w:val="18"/>
+                <w:szCs w:val="18"/>
+              </w:rPr>
+              <w:t xml:space="preserve">France Info / F2</w:t>
+            </w:r>
+          </w:p>
+        </w:tc>
+        <w:tc>
+          <w:tcPr>
+            <w:tcW w:type="dxa" w:w="2006"/>
+            <w:tcBorders>
+              <w:top w:val="single" w:color="AAAAAA" w:sz="1"/>
+              <w:left w:val="single" w:color="AAAAAA" w:sz="1"/>
+              <w:bottom w:val="single" w:color="AAAAAA" w:sz="1"/>
+              <w:right w:val="single" w:color="AAAAAA" w:sz="1"/>
+            </w:tcBorders>
+            <w:shd w:fill="F5F5F5" w:val="clear"/>
+            <w:tcMar>
+              <w:top w:type="dxa" w:w="60"/>
+              <w:left w:type="dxa" w:w="100"/>
+              <w:bottom w:type="dxa" w:w="60"/>
+              <w:right w:type="dxa" w:w="100"/>
+            </w:tcMar>
+          </w:tcPr>
+          <w:p>
+            <w:r>
+              <w:rPr>
+                <w:rFonts w:ascii="Arial" w:cs="Arial" w:eastAsia="Arial" w:hAnsi="Arial"/>
+                <w:sz w:val="18"/>
+                <w:szCs w:val="18"/>
+              </w:rPr>
+              <w:t xml:space="preserve">France Télévisions (État)</w:t>
+            </w:r>
+          </w:p>
+        </w:tc>
+        <w:tc>
+          <w:tcPr>
+            <w:tcW w:type="dxa" w:w="1600"/>
+            <w:tcBorders>
+              <w:top w:val="single" w:color="AAAAAA" w:sz="1"/>
+              <w:left w:val="single" w:color="AAAAAA" w:sz="1"/>
+              <w:bottom w:val="single" w:color="AAAAAA" w:sz="1"/>
+              <w:right w:val="single" w:color="AAAAAA" w:sz="1"/>
+            </w:tcBorders>
+            <w:shd w:fill="F5F5F5" w:val="clear"/>
+            <w:tcMar>
+              <w:top w:type="dxa" w:w="60"/>
+              <w:left w:type="dxa" w:w="100"/>
+              <w:bottom w:type="dxa" w:w="60"/>
+              <w:right w:type="dxa" w:w="100"/>
+            </w:tcMar>
+          </w:tcPr>
+          <w:p>
+            <w:r>
+              <w:rPr>
+                <w:rFonts w:ascii="Arial" w:cs="Arial" w:eastAsia="Arial" w:hAnsi="Arial"/>
+                <w:sz w:val="18"/>
+                <w:szCs w:val="18"/>
+              </w:rPr>
+              <w:t xml:space="preserve">Service public</w:t>
+            </w:r>
+          </w:p>
+        </w:tc>
+        <w:tc>
+          <w:tcPr>
+            <w:tcW w:type="dxa" w:w="2200"/>
+            <w:tcBorders>
+              <w:top w:val="single" w:color="AAAAAA" w:sz="1"/>
+              <w:left w:val="single" w:color="AAAAAA" w:sz="1"/>
+              <w:bottom w:val="single" w:color="AAAAAA" w:sz="1"/>
+              <w:right w:val="single" w:color="AAAAAA" w:sz="1"/>
+            </w:tcBorders>
+            <w:shd w:fill="F5F5F5" w:val="clear"/>
+            <w:tcMar>
+              <w:top w:type="dxa" w:w="60"/>
+              <w:left w:type="dxa" w:w="100"/>
+              <w:bottom w:type="dxa" w:w="60"/>
+              <w:right w:type="dxa" w:w="100"/>
+            </w:tcMar>
+          </w:tcPr>
+          <w:p>
+            <w:r>
+              <w:rPr>
+                <w:rFonts w:ascii="Arial" w:cs="Arial" w:eastAsia="Arial" w:hAnsi="Arial"/>
+                <w:sz w:val="18"/>
+                <w:szCs w:val="18"/>
+              </w:rPr>
+              <w:t xml:space="preserve">Redevance + État</w:t>
+            </w:r>
+          </w:p>
+        </w:tc>
+        <w:tc>
+          <w:tcPr>
+            <w:tcW w:type="dxa" w:w="2000"/>
+            <w:tcBorders>
+              <w:top w:val="single" w:color="AAAAAA" w:sz="1"/>
+              <w:left w:val="single" w:color="AAAAAA" w:sz="1"/>
+              <w:bottom w:val="single" w:color="AAAAAA" w:sz="1"/>
+              <w:right w:val="single" w:color="AAAAAA" w:sz="1"/>
+            </w:tcBorders>
+            <w:shd w:fill="F5F5F5" w:val="clear"/>
+            <w:tcMar>
+              <w:top w:type="dxa" w:w="60"/>
+              <w:left w:type="dxa" w:w="100"/>
+              <w:bottom w:type="dxa" w:w="60"/>
+              <w:right w:type="dxa" w:w="100"/>
+            </w:tcMar>
+          </w:tcPr>
+          <w:p>
+            <w:r>
+              <w:rPr>
+                <w:rFonts w:ascii="Arial" w:cs="Arial" w:eastAsia="Arial" w:hAnsi="Arial"/>
+                <w:sz w:val="18"/>
+                <w:szCs w:val="18"/>
+              </w:rPr>
+              <w:t xml:space="preserve">Institutionnelle</w:t>
+            </w:r>
+          </w:p>
+        </w:tc>
+      </w:tr>
+      <w:tr>
+        <w:tc>
+          <w:tcPr>
+            <w:tcW w:type="dxa" w:w="1500"/>
+            <w:tcBorders>
+              <w:top w:val="single" w:color="AAAAAA" w:sz="1"/>
+              <w:left w:val="single" w:color="AAAAAA" w:sz="1"/>
+              <w:bottom w:val="single" w:color="AAAAAA" w:sz="1"/>
+              <w:right w:val="single" w:color="AAAAAA" w:sz="1"/>
+            </w:tcBorders>
+            <w:shd w:fill="FFFFFF" w:val="clear"/>
+            <w:tcMar>
+              <w:top w:type="dxa" w:w="60"/>
+              <w:left w:type="dxa" w:w="100"/>
+              <w:bottom w:type="dxa" w:w="60"/>
+              <w:right w:type="dxa" w:w="100"/>
+            </w:tcMar>
+          </w:tcPr>
+          <w:p>
+            <w:r>
+              <w:rPr>
+                <w:rFonts w:ascii="Arial" w:cs="Arial" w:eastAsia="Arial" w:hAnsi="Arial"/>
+                <w:sz w:val="18"/>
+                <w:szCs w:val="18"/>
+              </w:rPr>
+              <w:t xml:space="preserve">Mediapart</w:t>
+            </w:r>
+          </w:p>
+        </w:tc>
+        <w:tc>
+          <w:tcPr>
+            <w:tcW w:type="dxa" w:w="2006"/>
+            <w:tcBorders>
+              <w:top w:val="single" w:color="AAAAAA" w:sz="1"/>
+              <w:left w:val="single" w:color="AAAAAA" w:sz="1"/>
+              <w:bottom w:val="single" w:color="AAAAAA" w:sz="1"/>
+              <w:right w:val="single" w:color="AAAAAA" w:sz="1"/>
+            </w:tcBorders>
+            <w:shd w:fill="FFFFFF" w:val="clear"/>
+            <w:tcMar>
+              <w:top w:type="dxa" w:w="60"/>
+              <w:left w:type="dxa" w:w="100"/>
+              <w:bottom w:type="dxa" w:w="60"/>
+              <w:right w:type="dxa" w:w="100"/>
+            </w:tcMar>
+          </w:tcPr>
+          <w:p>
+            <w:r>
+              <w:rPr>
+                <w:rFonts w:ascii="Arial" w:cs="Arial" w:eastAsia="Arial" w:hAnsi="Arial"/>
+                <w:sz w:val="18"/>
+                <w:szCs w:val="18"/>
+              </w:rPr>
+              <w:t xml:space="preserve">FPL (but non lucr.)</w:t>
+            </w:r>
+          </w:p>
+        </w:tc>
+        <w:tc>
+          <w:tcPr>
+            <w:tcW w:type="dxa" w:w="1600"/>
+            <w:tcBorders>
+              <w:top w:val="single" w:color="AAAAAA" w:sz="1"/>
+              <w:left w:val="single" w:color="AAAAAA" w:sz="1"/>
+              <w:bottom w:val="single" w:color="AAAAAA" w:sz="1"/>
+              <w:right w:val="single" w:color="AAAAAA" w:sz="1"/>
+            </w:tcBorders>
+            <w:shd w:fill="FFFFFF" w:val="clear"/>
+            <w:tcMar>
+              <w:top w:type="dxa" w:w="60"/>
+              <w:left w:type="dxa" w:w="100"/>
+              <w:bottom w:type="dxa" w:w="60"/>
+              <w:right w:type="dxa" w:w="100"/>
+            </w:tcMar>
+          </w:tcPr>
+          <w:p>
+            <w:r>
+              <w:rPr>
+                <w:rFonts w:ascii="Arial" w:cs="Arial" w:eastAsia="Arial" w:hAnsi="Arial"/>
+                <w:sz w:val="18"/>
+                <w:szCs w:val="18"/>
+              </w:rPr>
+              <w:t xml:space="preserve">Gauche investig.</w:t>
+            </w:r>
+          </w:p>
+        </w:tc>
+        <w:tc>
+          <w:tcPr>
+            <w:tcW w:type="dxa" w:w="2200"/>
+            <w:tcBorders>
+              <w:top w:val="single" w:color="AAAAAA" w:sz="1"/>
+              <w:left w:val="single" w:color="AAAAAA" w:sz="1"/>
+              <w:bottom w:val="single" w:color="AAAAAA" w:sz="1"/>
+              <w:right w:val="single" w:color="AAAAAA" w:sz="1"/>
+            </w:tcBorders>
+            <w:shd w:fill="FFFFFF" w:val="clear"/>
+            <w:tcMar>
+              <w:top w:type="dxa" w:w="60"/>
+              <w:left w:type="dxa" w:w="100"/>
+              <w:bottom w:type="dxa" w:w="60"/>
+              <w:right w:type="dxa" w:w="100"/>
+            </w:tcMar>
+          </w:tcPr>
+          <w:p>
+            <w:r>
+              <w:rPr>
+                <w:rFonts w:ascii="Arial" w:cs="Arial" w:eastAsia="Arial" w:hAnsi="Arial"/>
+                <w:sz w:val="18"/>
+                <w:szCs w:val="18"/>
+              </w:rPr>
+              <w:t xml:space="preserve">Abonnés 95 %, 0 sub.</w:t>
+            </w:r>
+          </w:p>
+        </w:tc>
+        <w:tc>
+          <w:tcPr>
+            <w:tcW w:type="dxa" w:w="2000"/>
+            <w:tcBorders>
+              <w:top w:val="single" w:color="AAAAAA" w:sz="1"/>
+              <w:left w:val="single" w:color="AAAAAA" w:sz="1"/>
+              <w:bottom w:val="single" w:color="AAAAAA" w:sz="1"/>
+              <w:right w:val="single" w:color="AAAAAA" w:sz="1"/>
+            </w:tcBorders>
+            <w:shd w:fill="FFFFFF" w:val="clear"/>
+            <w:tcMar>
+              <w:top w:type="dxa" w:w="60"/>
+              <w:left w:type="dxa" w:w="100"/>
+              <w:bottom w:type="dxa" w:w="60"/>
+              <w:right w:type="dxa" w:w="100"/>
+            </w:tcMar>
+          </w:tcPr>
+          <w:p>
+            <w:r>
+              <w:rPr>
+                <w:rFonts w:ascii="Arial" w:cs="Arial" w:eastAsia="Arial" w:hAnsi="Arial"/>
+                <w:sz w:val="18"/>
+                <w:szCs w:val="18"/>
+              </w:rPr>
+              <w:t xml:space="preserve">Critique (cabinet, GJ)</w:t>
+            </w:r>
+          </w:p>
+        </w:tc>
+      </w:tr>
+      <w:tr>
+        <w:tc>
+          <w:tcPr>
+            <w:tcW w:type="dxa" w:w="1500"/>
+            <w:tcBorders>
+              <w:top w:val="single" w:color="AAAAAA" w:sz="1"/>
+              <w:left w:val="single" w:color="AAAAAA" w:sz="1"/>
+              <w:bottom w:val="single" w:color="AAAAAA" w:sz="1"/>
+              <w:right w:val="single" w:color="AAAAAA" w:sz="1"/>
+            </w:tcBorders>
+            <w:shd w:fill="F5F5F5" w:val="clear"/>
+            <w:tcMar>
+              <w:top w:type="dxa" w:w="60"/>
+              <w:left w:type="dxa" w:w="100"/>
+              <w:bottom w:type="dxa" w:w="60"/>
+              <w:right w:type="dxa" w:w="100"/>
+            </w:tcMar>
+          </w:tcPr>
+          <w:p>
+            <w:r>
+              <w:rPr>
+                <w:rFonts w:ascii="Arial" w:cs="Arial" w:eastAsia="Arial" w:hAnsi="Arial"/>
+                <w:sz w:val="18"/>
+                <w:szCs w:val="18"/>
+              </w:rPr>
+              <w:t xml:space="preserve">Blast</w:t>
+            </w:r>
+          </w:p>
+        </w:tc>
+        <w:tc>
+          <w:tcPr>
+            <w:tcW w:type="dxa" w:w="2006"/>
+            <w:tcBorders>
+              <w:top w:val="single" w:color="AAAAAA" w:sz="1"/>
+              <w:left w:val="single" w:color="AAAAAA" w:sz="1"/>
+              <w:bottom w:val="single" w:color="AAAAAA" w:sz="1"/>
+              <w:right w:val="single" w:color="AAAAAA" w:sz="1"/>
+            </w:tcBorders>
+            <w:shd w:fill="F5F5F5" w:val="clear"/>
+            <w:tcMar>
+              <w:top w:type="dxa" w:w="60"/>
+              <w:left w:type="dxa" w:w="100"/>
+              <w:bottom w:type="dxa" w:w="60"/>
+              <w:right w:type="dxa" w:w="100"/>
+            </w:tcMar>
+          </w:tcPr>
+          <w:p>
+            <w:r>
+              <w:rPr>
+                <w:rFonts w:ascii="Arial" w:cs="Arial" w:eastAsia="Arial" w:hAnsi="Arial"/>
+                <w:sz w:val="18"/>
+                <w:szCs w:val="18"/>
+              </w:rPr>
+              <w:t xml:space="preserve">Denis Robert (BNL)</w:t>
+            </w:r>
+          </w:p>
+        </w:tc>
+        <w:tc>
+          <w:tcPr>
+            <w:tcW w:type="dxa" w:w="1600"/>
+            <w:tcBorders>
+              <w:top w:val="single" w:color="AAAAAA" w:sz="1"/>
+              <w:left w:val="single" w:color="AAAAAA" w:sz="1"/>
+              <w:bottom w:val="single" w:color="AAAAAA" w:sz="1"/>
+              <w:right w:val="single" w:color="AAAAAA" w:sz="1"/>
+            </w:tcBorders>
+            <w:shd w:fill="F5F5F5" w:val="clear"/>
+            <w:tcMar>
+              <w:top w:type="dxa" w:w="60"/>
+              <w:left w:type="dxa" w:w="100"/>
+              <w:bottom w:type="dxa" w:w="60"/>
+              <w:right w:type="dxa" w:w="100"/>
+            </w:tcMar>
+          </w:tcPr>
+          <w:p>
+            <w:r>
+              <w:rPr>
+                <w:rFonts w:ascii="Arial" w:cs="Arial" w:eastAsia="Arial" w:hAnsi="Arial"/>
+                <w:sz w:val="18"/>
+                <w:szCs w:val="18"/>
+              </w:rPr>
+              <w:t xml:space="preserve">Gauche investig.</w:t>
+            </w:r>
+          </w:p>
+        </w:tc>
+        <w:tc>
+          <w:tcPr>
+            <w:tcW w:type="dxa" w:w="2200"/>
+            <w:tcBorders>
+              <w:top w:val="single" w:color="AAAAAA" w:sz="1"/>
+              <w:left w:val="single" w:color="AAAAAA" w:sz="1"/>
+              <w:bottom w:val="single" w:color="AAAAAA" w:sz="1"/>
+              <w:right w:val="single" w:color="AAAAAA" w:sz="1"/>
+            </w:tcBorders>
+            <w:shd w:fill="F5F5F5" w:val="clear"/>
+            <w:tcMar>
+              <w:top w:type="dxa" w:w="60"/>
+              <w:left w:type="dxa" w:w="100"/>
+              <w:bottom w:type="dxa" w:w="60"/>
+              <w:right w:type="dxa" w:w="100"/>
+            </w:tcMar>
+          </w:tcPr>
+          <w:p>
+            <w:r>
+              <w:rPr>
+                <w:rFonts w:ascii="Arial" w:cs="Arial" w:eastAsia="Arial" w:hAnsi="Arial"/>
+                <w:sz w:val="18"/>
+                <w:szCs w:val="18"/>
+              </w:rPr>
+              <w:t xml:space="preserve">Crowdf. + 803k&amp;#x20AC; aide</w:t>
+            </w:r>
+          </w:p>
+        </w:tc>
+        <w:tc>
+          <w:tcPr>
+            <w:tcW w:type="dxa" w:w="2000"/>
+            <w:tcBorders>
+              <w:top w:val="single" w:color="AAAAAA" w:sz="1"/>
+              <w:left w:val="single" w:color="AAAAAA" w:sz="1"/>
+              <w:bottom w:val="single" w:color="AAAAAA" w:sz="1"/>
+              <w:right w:val="single" w:color="AAAAAA" w:sz="1"/>
+            </w:tcBorders>
+            <w:shd w:fill="F5F5F5" w:val="clear"/>
+            <w:tcMar>
+              <w:top w:type="dxa" w:w="60"/>
+              <w:left w:type="dxa" w:w="100"/>
+              <w:bottom w:type="dxa" w:w="60"/>
+              <w:right w:type="dxa" w:w="100"/>
+            </w:tcMar>
+          </w:tcPr>
+          <w:p>
+            <w:r>
+              <w:rPr>
+                <w:rFonts w:ascii="Arial" w:cs="Arial" w:eastAsia="Arial" w:hAnsi="Arial"/>
+                <w:sz w:val="18"/>
+                <w:szCs w:val="18"/>
+              </w:rPr>
+              <w:t xml:space="preserve">Critique (Atos, Kohler)</w:t>
+            </w:r>
+          </w:p>
+        </w:tc>
+      </w:tr>
+      <w:tr>
+        <w:tc>
+          <w:tcPr>
+            <w:tcW w:type="dxa" w:w="1500"/>
+            <w:tcBorders>
+              <w:top w:val="single" w:color="AAAAAA" w:sz="1"/>
+              <w:left w:val="single" w:color="AAAAAA" w:sz="1"/>
+              <w:bottom w:val="single" w:color="AAAAAA" w:sz="1"/>
+              <w:right w:val="single" w:color="AAAAAA" w:sz="1"/>
+            </w:tcBorders>
+            <w:shd w:fill="FFFFFF" w:val="clear"/>
+            <w:tcMar>
+              <w:top w:type="dxa" w:w="60"/>
+              <w:left w:type="dxa" w:w="100"/>
+              <w:bottom w:type="dxa" w:w="60"/>
+              <w:right w:type="dxa" w:w="100"/>
+            </w:tcMar>
+          </w:tcPr>
+          <w:p>
+            <w:r>
+              <w:rPr>
+                <w:rFonts w:ascii="Arial" w:cs="Arial" w:eastAsia="Arial" w:hAnsi="Arial"/>
+                <w:sz w:val="18"/>
+                <w:szCs w:val="18"/>
+              </w:rPr>
+              <w:t xml:space="preserve">Polémia</w:t>
+            </w:r>
+          </w:p>
+        </w:tc>
+        <w:tc>
+          <w:tcPr>
+            <w:tcW w:type="dxa" w:w="2006"/>
+            <w:tcBorders>
+              <w:top w:val="single" w:color="AAAAAA" w:sz="1"/>
+              <w:left w:val="single" w:color="AAAAAA" w:sz="1"/>
+              <w:bottom w:val="single" w:color="AAAAAA" w:sz="1"/>
+              <w:right w:val="single" w:color="AAAAAA" w:sz="1"/>
+            </w:tcBorders>
+            <w:shd w:fill="FFFFFF" w:val="clear"/>
+            <w:tcMar>
+              <w:top w:type="dxa" w:w="60"/>
+              <w:left w:type="dxa" w:w="100"/>
+              <w:bottom w:type="dxa" w:w="60"/>
+              <w:right w:type="dxa" w:w="100"/>
+            </w:tcMar>
+          </w:tcPr>
+          <w:p>
+            <w:r>
+              <w:rPr>
+                <w:rFonts w:ascii="Arial" w:cs="Arial" w:eastAsia="Arial" w:hAnsi="Arial"/>
+                <w:sz w:val="18"/>
+                <w:szCs w:val="18"/>
+              </w:rPr>
+              <w:t xml:space="preserve">Fond. Polémia (Le Gallou)</w:t>
+            </w:r>
+          </w:p>
+        </w:tc>
+        <w:tc>
+          <w:tcPr>
+            <w:tcW w:type="dxa" w:w="1600"/>
+            <w:tcBorders>
+              <w:top w:val="single" w:color="AAAAAA" w:sz="1"/>
+              <w:left w:val="single" w:color="AAAAAA" w:sz="1"/>
+              <w:bottom w:val="single" w:color="AAAAAA" w:sz="1"/>
+              <w:right w:val="single" w:color="AAAAAA" w:sz="1"/>
+            </w:tcBorders>
+            <w:shd w:fill="FFFFFF" w:val="clear"/>
+            <w:tcMar>
+              <w:top w:type="dxa" w:w="60"/>
+              <w:left w:type="dxa" w:w="100"/>
+              <w:bottom w:type="dxa" w:w="60"/>
+              <w:right w:type="dxa" w:w="100"/>
+            </w:tcMar>
+          </w:tcPr>
+          <w:p>
+            <w:r>
+              <w:rPr>
+                <w:rFonts w:ascii="Arial" w:cs="Arial" w:eastAsia="Arial" w:hAnsi="Arial"/>
+                <w:sz w:val="18"/>
+                <w:szCs w:val="18"/>
+              </w:rPr>
+              <w:t xml:space="preserve">Droite identitaire</w:t>
+            </w:r>
+          </w:p>
+        </w:tc>
+        <w:tc>
+          <w:tcPr>
+            <w:tcW w:type="dxa" w:w="2200"/>
+            <w:tcBorders>
+              <w:top w:val="single" w:color="AAAAAA" w:sz="1"/>
+              <w:left w:val="single" w:color="AAAAAA" w:sz="1"/>
+              <w:bottom w:val="single" w:color="AAAAAA" w:sz="1"/>
+              <w:right w:val="single" w:color="AAAAAA" w:sz="1"/>
+            </w:tcBorders>
+            <w:shd w:fill="FFFFFF" w:val="clear"/>
+            <w:tcMar>
+              <w:top w:type="dxa" w:w="60"/>
+              <w:left w:type="dxa" w:w="100"/>
+              <w:bottom w:type="dxa" w:w="60"/>
+              <w:right w:type="dxa" w:w="100"/>
+            </w:tcMar>
+          </w:tcPr>
+          <w:p>
+            <w:r>
+              <w:rPr>
+                <w:rFonts w:ascii="Arial" w:cs="Arial" w:eastAsia="Arial" w:hAnsi="Arial"/>
+                <w:sz w:val="18"/>
+                <w:szCs w:val="18"/>
+              </w:rPr>
+              <w:t xml:space="preserve">Dons</w:t>
+            </w:r>
+          </w:p>
+        </w:tc>
+        <w:tc>
+          <w:tcPr>
+            <w:tcW w:type="dxa" w:w="2000"/>
+            <w:tcBorders>
+              <w:top w:val="single" w:color="AAAAAA" w:sz="1"/>
+              <w:left w:val="single" w:color="AAAAAA" w:sz="1"/>
+              <w:bottom w:val="single" w:color="AAAAAA" w:sz="1"/>
+              <w:right w:val="single" w:color="AAAAAA" w:sz="1"/>
+            </w:tcBorders>
+            <w:shd w:fill="FFFFFF" w:val="clear"/>
+            <w:tcMar>
+              <w:top w:type="dxa" w:w="60"/>
+              <w:left w:type="dxa" w:w="100"/>
+              <w:bottom w:type="dxa" w:w="60"/>
+              <w:right w:type="dxa" w:w="100"/>
+            </w:tcMar>
+          </w:tcPr>
+          <w:p>
+            <w:r>
+              <w:rPr>
+                <w:rFonts w:ascii="Arial" w:cs="Arial" w:eastAsia="Arial" w:hAnsi="Arial"/>
+                <w:sz w:val="18"/>
+                <w:szCs w:val="18"/>
+              </w:rPr>
+              <w:t xml:space="preserve">Critique (FCF, Chine)</w:t>
+            </w:r>
+          </w:p>
+        </w:tc>
+      </w:tr>
+      <w:tr>
+        <w:tc>
+          <w:tcPr>
+            <w:tcW w:type="dxa" w:w="1500"/>
+            <w:tcBorders>
+              <w:top w:val="single" w:color="AAAAAA" w:sz="1"/>
+              <w:left w:val="single" w:color="AAAAAA" w:sz="1"/>
+              <w:bottom w:val="single" w:color="AAAAAA" w:sz="1"/>
+              <w:right w:val="single" w:color="AAAAAA" w:sz="1"/>
+            </w:tcBorders>
+            <w:shd w:fill="F5F5F5" w:val="clear"/>
+            <w:tcMar>
+              <w:top w:type="dxa" w:w="60"/>
+              <w:left w:type="dxa" w:w="100"/>
+              <w:bottom w:type="dxa" w:w="60"/>
+              <w:right w:type="dxa" w:w="100"/>
+            </w:tcMar>
+          </w:tcPr>
+          <w:p>
+            <w:r>
+              <w:rPr>
+                <w:rFonts w:ascii="Arial" w:cs="Arial" w:eastAsia="Arial" w:hAnsi="Arial"/>
+                <w:sz w:val="18"/>
+                <w:szCs w:val="18"/>
+              </w:rPr>
+              <w:t xml:space="preserve">Révolution Perm.</w:t>
+            </w:r>
+          </w:p>
+        </w:tc>
+        <w:tc>
+          <w:tcPr>
+            <w:tcW w:type="dxa" w:w="2006"/>
+            <w:tcBorders>
+              <w:top w:val="single" w:color="AAAAAA" w:sz="1"/>
+              <w:left w:val="single" w:color="AAAAAA" w:sz="1"/>
+              <w:bottom w:val="single" w:color="AAAAAA" w:sz="1"/>
+              <w:right w:val="single" w:color="AAAAAA" w:sz="1"/>
+            </w:tcBorders>
+            <w:shd w:fill="F5F5F5" w:val="clear"/>
+            <w:tcMar>
+              <w:top w:type="dxa" w:w="60"/>
+              <w:left w:type="dxa" w:w="100"/>
+              <w:bottom w:type="dxa" w:w="60"/>
+              <w:right w:type="dxa" w:w="100"/>
+            </w:tcMar>
+          </w:tcPr>
+          <w:p>
+            <w:r>
+              <w:rPr>
+                <w:rFonts w:ascii="Arial" w:cs="Arial" w:eastAsia="Arial" w:hAnsi="Arial"/>
+                <w:sz w:val="18"/>
+                <w:szCs w:val="18"/>
+              </w:rPr>
+              <w:t xml:space="preserve">NPA / courant RP</w:t>
+            </w:r>
+          </w:p>
+        </w:tc>
+        <w:tc>
+          <w:tcPr>
+            <w:tcW w:type="dxa" w:w="1600"/>
+            <w:tcBorders>
+              <w:top w:val="single" w:color="AAAAAA" w:sz="1"/>
+              <w:left w:val="single" w:color="AAAAAA" w:sz="1"/>
+              <w:bottom w:val="single" w:color="AAAAAA" w:sz="1"/>
+              <w:right w:val="single" w:color="AAAAAA" w:sz="1"/>
+            </w:tcBorders>
+            <w:shd w:fill="F5F5F5" w:val="clear"/>
+            <w:tcMar>
+              <w:top w:type="dxa" w:w="60"/>
+              <w:left w:type="dxa" w:w="100"/>
+              <w:bottom w:type="dxa" w:w="60"/>
+              <w:right w:type="dxa" w:w="100"/>
+            </w:tcMar>
+          </w:tcPr>
+          <w:p>
+            <w:r>
+              <w:rPr>
+                <w:rFonts w:ascii="Arial" w:cs="Arial" w:eastAsia="Arial" w:hAnsi="Arial"/>
+                <w:sz w:val="18"/>
+                <w:szCs w:val="18"/>
+              </w:rPr>
+              <w:t xml:space="preserve">Extrême gauche</w:t>
+            </w:r>
+          </w:p>
+        </w:tc>
+        <w:tc>
+          <w:tcPr>
+            <w:tcW w:type="dxa" w:w="2200"/>
+            <w:tcBorders>
+              <w:top w:val="single" w:color="AAAAAA" w:sz="1"/>
+              <w:left w:val="single" w:color="AAAAAA" w:sz="1"/>
+              <w:bottom w:val="single" w:color="AAAAAA" w:sz="1"/>
+              <w:right w:val="single" w:color="AAAAAA" w:sz="1"/>
+            </w:tcBorders>
+            <w:shd w:fill="F5F5F5" w:val="clear"/>
+            <w:tcMar>
+              <w:top w:type="dxa" w:w="60"/>
+              <w:left w:type="dxa" w:w="100"/>
+              <w:bottom w:type="dxa" w:w="60"/>
+              <w:right w:type="dxa" w:w="100"/>
+            </w:tcMar>
+          </w:tcPr>
+          <w:p>
+            <w:r>
+              <w:rPr>
+                <w:rFonts w:ascii="Arial" w:cs="Arial" w:eastAsia="Arial" w:hAnsi="Arial"/>
+                <w:sz w:val="18"/>
+                <w:szCs w:val="18"/>
+              </w:rPr>
+              <w:t xml:space="preserve">Militants</w:t>
+            </w:r>
+          </w:p>
+        </w:tc>
+        <w:tc>
+          <w:tcPr>
+            <w:tcW w:type="dxa" w:w="2000"/>
+            <w:tcBorders>
+              <w:top w:val="single" w:color="AAAAAA" w:sz="1"/>
+              <w:left w:val="single" w:color="AAAAAA" w:sz="1"/>
+              <w:bottom w:val="single" w:color="AAAAAA" w:sz="1"/>
+              <w:right w:val="single" w:color="AAAAAA" w:sz="1"/>
+            </w:tcBorders>
+            <w:shd w:fill="F5F5F5" w:val="clear"/>
+            <w:tcMar>
+              <w:top w:type="dxa" w:w="60"/>
+              <w:left w:type="dxa" w:w="100"/>
+              <w:bottom w:type="dxa" w:w="60"/>
+              <w:right w:type="dxa" w:w="100"/>
+            </w:tcMar>
+          </w:tcPr>
+          <w:p>
+            <w:r>
+              <w:rPr>
+                <w:rFonts w:ascii="Arial" w:cs="Arial" w:eastAsia="Arial" w:hAnsi="Arial"/>
+                <w:sz w:val="18"/>
+                <w:szCs w:val="18"/>
+              </w:rPr>
+              <w:t xml:space="preserve">Critique (GJ, Nuñez)</w:t>
+            </w:r>
+          </w:p>
+        </w:tc>
+      </w:tr>
+      <w:tr>
+        <w:tc>
+          <w:tcPr>
+            <w:tcW w:type="dxa" w:w="1500"/>
+            <w:tcBorders>
+              <w:top w:val="single" w:color="AAAAAA" w:sz="1"/>
+              <w:left w:val="single" w:color="AAAAAA" w:sz="1"/>
+              <w:bottom w:val="single" w:color="AAAAAA" w:sz="1"/>
+              <w:right w:val="single" w:color="AAAAAA" w:sz="1"/>
+            </w:tcBorders>
+            <w:shd w:fill="FFFFFF" w:val="clear"/>
+            <w:tcMar>
+              <w:top w:type="dxa" w:w="60"/>
+              <w:left w:type="dxa" w:w="100"/>
+              <w:bottom w:type="dxa" w:w="60"/>
+              <w:right w:type="dxa" w:w="100"/>
+            </w:tcMar>
+          </w:tcPr>
+          <w:p>
+            <w:r>
+              <w:rPr>
+                <w:rFonts w:ascii="Arial" w:cs="Arial" w:eastAsia="Arial" w:hAnsi="Arial"/>
+                <w:sz w:val="18"/>
+                <w:szCs w:val="18"/>
+              </w:rPr>
+              <w:t xml:space="preserve">Blvd Voltaire</w:t>
+            </w:r>
+          </w:p>
+        </w:tc>
+        <w:tc>
+          <w:tcPr>
+            <w:tcW w:type="dxa" w:w="2006"/>
+            <w:tcBorders>
+              <w:top w:val="single" w:color="AAAAAA" w:sz="1"/>
+              <w:left w:val="single" w:color="AAAAAA" w:sz="1"/>
+              <w:bottom w:val="single" w:color="AAAAAA" w:sz="1"/>
+              <w:right w:val="single" w:color="AAAAAA" w:sz="1"/>
+            </w:tcBorders>
+            <w:shd w:fill="FFFFFF" w:val="clear"/>
+            <w:tcMar>
+              <w:top w:type="dxa" w:w="60"/>
+              <w:left w:type="dxa" w:w="100"/>
+              <w:bottom w:type="dxa" w:w="60"/>
+              <w:right w:type="dxa" w:w="100"/>
+            </w:tcMar>
+          </w:tcPr>
+          <w:p>
+            <w:r>
+              <w:rPr>
+                <w:rFonts w:ascii="Arial" w:cs="Arial" w:eastAsia="Arial" w:hAnsi="Arial"/>
+                <w:sz w:val="18"/>
+                <w:szCs w:val="18"/>
+              </w:rPr>
+              <w:t xml:space="preserve">Indép. (R. Ménard)</w:t>
+            </w:r>
+          </w:p>
+        </w:tc>
+        <w:tc>
+          <w:tcPr>
+            <w:tcW w:type="dxa" w:w="1600"/>
+            <w:tcBorders>
+              <w:top w:val="single" w:color="AAAAAA" w:sz="1"/>
+              <w:left w:val="single" w:color="AAAAAA" w:sz="1"/>
+              <w:bottom w:val="single" w:color="AAAAAA" w:sz="1"/>
+              <w:right w:val="single" w:color="AAAAAA" w:sz="1"/>
+            </w:tcBorders>
+            <w:shd w:fill="FFFFFF" w:val="clear"/>
+            <w:tcMar>
+              <w:top w:type="dxa" w:w="60"/>
+              <w:left w:type="dxa" w:w="100"/>
+              <w:bottom w:type="dxa" w:w="60"/>
+              <w:right w:type="dxa" w:w="100"/>
+            </w:tcMar>
+          </w:tcPr>
+          <w:p>
+            <w:r>
+              <w:rPr>
+                <w:rFonts w:ascii="Arial" w:cs="Arial" w:eastAsia="Arial" w:hAnsi="Arial"/>
+                <w:sz w:val="18"/>
+                <w:szCs w:val="18"/>
+              </w:rPr>
+              <w:t xml:space="preserve">Droite souverain.</w:t>
+            </w:r>
+          </w:p>
+        </w:tc>
+        <w:tc>
+          <w:tcPr>
+            <w:tcW w:type="dxa" w:w="2200"/>
+            <w:tcBorders>
+              <w:top w:val="single" w:color="AAAAAA" w:sz="1"/>
+              <w:left w:val="single" w:color="AAAAAA" w:sz="1"/>
+              <w:bottom w:val="single" w:color="AAAAAA" w:sz="1"/>
+              <w:right w:val="single" w:color="AAAAAA" w:sz="1"/>
+            </w:tcBorders>
+            <w:shd w:fill="FFFFFF" w:val="clear"/>
+            <w:tcMar>
+              <w:top w:type="dxa" w:w="60"/>
+              <w:left w:type="dxa" w:w="100"/>
+              <w:bottom w:type="dxa" w:w="60"/>
+              <w:right w:type="dxa" w:w="100"/>
+            </w:tcMar>
+          </w:tcPr>
+          <w:p>
+            <w:r>
+              <w:rPr>
+                <w:rFonts w:ascii="Arial" w:cs="Arial" w:eastAsia="Arial" w:hAnsi="Arial"/>
+                <w:sz w:val="18"/>
+                <w:szCs w:val="18"/>
+              </w:rPr>
+              <w:t xml:space="preserve">Dons + pub</w:t>
+            </w:r>
+          </w:p>
+        </w:tc>
+        <w:tc>
+          <w:tcPr>
+            <w:tcW w:type="dxa" w:w="2000"/>
+            <w:tcBorders>
+              <w:top w:val="single" w:color="AAAAAA" w:sz="1"/>
+              <w:left w:val="single" w:color="AAAAAA" w:sz="1"/>
+              <w:bottom w:val="single" w:color="AAAAAA" w:sz="1"/>
+              <w:right w:val="single" w:color="AAAAAA" w:sz="1"/>
+            </w:tcBorders>
+            <w:shd w:fill="FFFFFF" w:val="clear"/>
+            <w:tcMar>
+              <w:top w:type="dxa" w:w="60"/>
+              <w:left w:type="dxa" w:w="100"/>
+              <w:bottom w:type="dxa" w:w="60"/>
+              <w:right w:type="dxa" w:w="100"/>
+            </w:tcMar>
+          </w:tcPr>
+          <w:p>
+            <w:r>
+              <w:rPr>
+                <w:rFonts w:ascii="Arial" w:cs="Arial" w:eastAsia="Arial" w:hAnsi="Arial"/>
+                <w:sz w:val="18"/>
+                <w:szCs w:val="18"/>
+              </w:rPr>
+              <w:t xml:space="preserve">Critique (Atos, matraqu.)</w:t>
+            </w:r>
+          </w:p>
+        </w:tc>
+      </w:tr>
+    </w:tbl>
+    <w:p>
+      <w:pPr>
+        <w:spacing w:after="120" w:line="276"/>
+        <w:jc w:val="both"/>
+      </w:pPr>
+      <w:r>
+        <w:rPr>
+          <w:rFonts w:ascii="Georgia" w:cs="Georgia" w:eastAsia="Georgia" w:hAnsi="Georgia"/>
+          <w:i/>
+          <w:iCs/>
+          <w:sz w:val="20"/>
+          <w:szCs w:val="20"/>
+        </w:rPr>
+        <w:t xml:space="preserve">Lecture MAS : La convergence des sources critiques de gauche (Mediapart, Blast, Révolution Permanente), de droite identitaire (Polémia), de droite souverainiste (Boulevard Voltaire) et de droite dure (CNews pour certains sujets) sur les mêmes faits (pantouflage Atos, répression GJ, réseaux FCF) renforce considérablement la fiabilité factuelle. Seuls BFMTV/La Tribune dimanche (CMA CGM/Saadé) produisent un narratif structurellement favorable à Philippe.</w:t>
       </w:r>
     </w:p>
     <w:p>

</xml_diff>